<commit_message>
Update the unpublished deletion wording for the account-deletion gap fix.
Portfolio, credential, service, service-area, and PPP-side Connect records are removed, along with orphaned project photos. Acceptance records keep browser information, and estimates and project descriptions stay.

Co-authored-by: 1319Dev <1319Dev@users.noreply.github.com>
</commit_message>
<xml_diff>
--- a/docs/legal/PPP-Legal-Documents-DRAFT.docx
+++ b/docs/legal/PPP-Legal-Documents-DRAFT.docx
@@ -1285,7 +1285,7 @@
         <w:pStyle w:val="Compact"/>
       </w:pPr>
       <w:r>
-        <w:t xml:space="preserve">You can delete your account from the account screen. The login is removed. Some marketplace records stay with your name and contact cleared. Portfolio rows, credentials, messages, and older audit notes can remain, as described below. Stripe keeps its own payment records. PPP does not send Stripe a deletion notice. The product does not include an in-app export.</w:t>
+        <w:t xml:space="preserve">You can delete your account from the account screen. The login is removed. Some marketplace records stay with your name and contact cleared. Messages, estimates, and project descriptions can remain, as described below. Portfolio photos, credentials, services, and service areas are removed. A small number of older internal security logs may still contain an email address. Stripe keeps its own payment records and the contractor’s Stripe account. PPP does not close that Stripe account and does not send Stripe a deletion notice. The product does not include an in-app export.</w:t>
       </w:r>
     </w:p>
     <w:p>
@@ -2282,7 +2282,7 @@
         <w:pStyle w:val="Compact"/>
       </w:pPr>
       <w:r>
-        <w:t xml:space="preserve">Projects other than those empty drafts. The street and precise coordinates are cleared, as above.</w:t>
+        <w:t xml:space="preserve">Projects other than those empty drafts. The project description stays. The street and precise coordinates are cleared, as above. Estimates on a kept project stay, including notes a contractor wrote.</w:t>
       </w:r>
     </w:p>
     <w:p>
@@ -2318,7 +2318,7 @@
         <w:pStyle w:val="Compact"/>
       </w:pPr>
       <w:r>
-        <w:t xml:space="preserve">The record of which agreement version you accepted and when. It is kept with an id that is no longer a live profile.</w:t>
+        <w:t xml:space="preserve">The record of which agreement version you accepted and when. That acceptance record keeps browser information from the acceptance. It is kept with an id that is no longer a live profile.</w:t>
       </w:r>
     </w:p>
     <w:p>
@@ -2356,15 +2356,23 @@
         <w:pStyle w:val="FirstParagraph"/>
       </w:pPr>
       <w:r>
-        <w:t xml:space="preserve">This deletion does not clear every row on that contractor profile. Portfolio photo rows, including titles, captions, and storage paths, credential rows, service rows, service-area rows, and the Stripe Connect account id are not cleared. The image files are part of the storage cleanup above. Project-photo rows on a project that is kept can still point at a file the cleanup tried to delete. Audit log entries can still contain an email address or an admin note from before the deletion.</w:t>
-      </w:r>
-    </w:p>
-    <w:p>
-      <w:pPr>
-        <w:pStyle w:val="BodyText"/>
-      </w:pPr>
-      <w:r>
-        <w:t xml:space="preserve">PPP does not send a deletion notice to Stripe, and PPP sends Stripe nothing as part of deletion. Stripe keeps its own payment, customer, and Checkout records under Stripe’s policy. PPP keeps the Stripe ids that refer to those records. PPP cannot delete card numbers it never stored. Deleting an account does not by itself refund the $9.99 or a $4.99 Connection Fee. Refund exceptions are in the</w:t>
+        <w:t xml:space="preserve">PPP removes that contractor’s portfolio photos, including titles and captions, credential entries, services, service areas, and the Stripe Connect record stored by PPP. Photo entries that are no longer tied to a kept project are removed. A photo entry on a kept project stays with that project.</w:t>
+      </w:r>
+    </w:p>
+    <w:p>
+      <w:pPr>
+        <w:pStyle w:val="BodyText"/>
+      </w:pPr>
+      <w:r>
+        <w:t xml:space="preserve">A small number of older internal security logs may contain an email address. Those logs cannot be altered.</w:t>
+      </w:r>
+    </w:p>
+    <w:p>
+      <w:pPr>
+        <w:pStyle w:val="BodyText"/>
+      </w:pPr>
+      <w:r>
+        <w:t xml:space="preserve">PPP does not send a deletion notice to Stripe, and PPP sends Stripe nothing as part of deletion. PPP does not close a contractor’s Stripe Connect account at Stripe. Stripe keeps that account, and its own payment, customer, and Checkout records, under Stripe’s policy. PPP keeps the Stripe ids that refer to those payment records. PPP cannot delete card numbers it never stored. Deleting an account does not by itself refund the $9.99 or a $4.99 Connection Fee. Refund exceptions are in the</w:t>
       </w:r>
       <w:r>
         <w:t xml:space="preserve"> </w:t>

</xml_diff>